<commit_message>
fix(lecons): corrige le résultat du test de path traversal (leçon 04)
Le test était annoncé en 403 ; il retourne 404. new URL() normalise
les .. avant que le chemin de fichier soit construit, et rien ne
décode le pourcentage — la branche 403 de serveur.js n'est atteignable
par aucune requête HTTP en l'état. Vérifié sur quatre formes, dont
curl --path-as-is.

Le garde-fou lui-même est correct et reste en place : un paragraphe
explique la cause et ce que le cas enseigne sur la défense en
profondeur. Formulation d'origine conservée dans le journal des
corrections. Dette notée dans PROJET.md pour la leçon 10.

Co-Authored-By: Claude Opus 5 <noreply@anthropic.com>
</commit_message>
<xml_diff>
--- a/livrables/lecons/2026-08-21_lecon-appli-ia_04_donnees-reelles-api-fichiers.docx
+++ b/livrables/lecons/2026-08-21_lecon-appli-ia_04_donnees-reelles-api-fichiers.docx
@@ -4566,7 +4566,7 @@
                 <w:sz w:val="20"/>
                 <w:szCs w:val="20"/>
               </w:rPr>
-              <w:t xml:space="preserve"># Erreur 3 : tentative de path traversal (doit retourner 403)</w:t>
+              <w:t xml:space="preserve"># Erreur 3 : tentative de path traversal (retourne 404 — voir l'explication sous le bloc)</w:t>
             </w:r>
           </w:p>
           <w:p>
@@ -4650,6 +4650,38 @@
           <w:szCs w:val="22"/>
         </w:rPr>
         <w:t xml:space="preserve">Pour chaque requête, identifie : le code HTTP retourné, le message JSON, et la ligne de serveur.js qui produit cette réponse.</w:t>
+      </w:r>
+    </w:p>
+    <w:p>
+      <w:pPr>
+        <w:spacing w:after="80" w:before="80" w:line="276"/>
+      </w:pPr>
+      <w:r>
+        <w:rPr>
+          <w:rFonts w:ascii="Times New Roman" w:cs="Times New Roman" w:eastAsia="Times New Roman" w:hAnsi="Times New Roman"/>
+          <w:b w:val="false"/>
+          <w:bCs w:val="false"/>
+          <w:color w:val="1F2937"/>
+          <w:sz w:val="22"/>
+          <w:szCs w:val="22"/>
+        </w:rPr>
+        <w:t xml:space="preserve">À propos de l'erreur 3 — pourquoi 404 et non 403. Le garde-fou path traversal existe bien (scripts/serveur.js, ligne 238 : le chemin résolu doit rester sous DOSSIER_PUBLIC), mais aucune requête HTTP ne l'atteint. new URL() applique la normalisation du standard WHATWG et réduit /../../etc/passwd à /etc/passwd avant même que le chemin de fichier soit construit ; path.resolve() le place alors sous public/, où rien n'existe — d'où le 404. Les variantes encodées (%2e%2e, ..%2f) ne changent rien, car aucun décodage de pourcentage n'intervient avant la résolution. Les quatre formes ont été testées le 21/08/2026, y compris avec curl --path-as-is pour écarter une normalisation par le client : toutes renvoient 404.</w:t>
+      </w:r>
+    </w:p>
+    <w:p>
+      <w:pPr>
+        <w:spacing w:after="80" w:before="80" w:line="276"/>
+      </w:pPr>
+      <w:r>
+        <w:rPr>
+          <w:rFonts w:ascii="Times New Roman" w:cs="Times New Roman" w:eastAsia="Times New Roman" w:hAnsi="Times New Roman"/>
+          <w:b w:val="false"/>
+          <w:bCs w:val="false"/>
+          <w:color w:val="1F2937"/>
+          <w:sz w:val="22"/>
+          <w:szCs w:val="22"/>
+        </w:rPr>
+        <w:t xml:space="preserve">Ce que ça t'apprend au-delà du résultat : un garde-fou inatteignable n'est pas un garde-fou inutile. Celui-ci ne sert à rien aujourd'hui parce que la couche d'avant fait déjà le travail — il servira le jour où cette couche changera : un décodage ajouté, une route servie autrement, un framework intercalé. C'est le principe de la défense en profondeur : on ne retire pas une protection au motif qu'une autre suffit pour l'instant. Retiens surtout la méthode : le résultat annoncé était faux, et il a suffi de lancer les quatre commandes pour le voir.</w:t>
       </w:r>
     </w:p>
     <w:p>
@@ -5688,6 +5720,86 @@
           <w:szCs w:val="22"/>
         </w:rPr>
         <w:t xml:space="preserve">Ce que tu devras avoir vérifié avant la leçon 05 : node scripts/serveur.js tourne sans erreur et /api/livrables?categorie=lecons retourne du JSON valide. C'est le point de départ.</w:t>
+      </w:r>
+    </w:p>
+    <w:p>
+      <w:pPr>
+        <w:spacing w:after="180" w:before="360"/>
+      </w:pPr>
+      <w:r>
+        <w:rPr>
+          <w:rFonts w:ascii="Times New Roman" w:cs="Times New Roman" w:eastAsia="Times New Roman" w:hAnsi="Times New Roman"/>
+          <w:b/>
+          <w:bCs/>
+          <w:color w:val="1B3A6B"/>
+          <w:sz w:val="52"/>
+          <w:szCs w:val="52"/>
+        </w:rPr>
+        <w:t xml:space="preserve">📝 Journal des corrections</w:t>
+      </w:r>
+    </w:p>
+    <w:p>
+      <w:pPr>
+        <w:spacing w:after="80" w:before="80" w:line="276"/>
+      </w:pPr>
+      <w:r>
+        <w:rPr>
+          <w:rFonts w:ascii="Times New Roman" w:cs="Times New Roman" w:eastAsia="Times New Roman" w:hAnsi="Times New Roman"/>
+          <w:b w:val="false"/>
+          <w:bCs w:val="false"/>
+          <w:color w:val="1F2937"/>
+          <w:sz w:val="22"/>
+          <w:szCs w:val="22"/>
+        </w:rPr>
+        <w:t xml:space="preserve">Leçon produite le 21/08/2026 à 09h19 (seconde version) et relue le jour même. La correction est fondue dans le texte ci-dessus ; la formulation d'origine est conservée ici.</w:t>
+      </w:r>
+    </w:p>
+    <w:p>
+      <w:pPr>
+        <w:spacing w:after="80" w:before="80" w:line="276"/>
+      </w:pPr>
+      <w:r>
+        <w:rPr>
+          <w:rFonts w:ascii="Times New Roman" w:cs="Times New Roman" w:eastAsia="Times New Roman" w:hAnsi="Times New Roman"/>
+          <w:b w:val="false"/>
+          <w:bCs w:val="false"/>
+          <w:color w:val="1F2937"/>
+          <w:sz w:val="22"/>
+          <w:szCs w:val="22"/>
+        </w:rPr>
+        <w:t xml:space="preserve">1. Résultat attendu du test de path traversal.</w:t>
+      </w:r>
+    </w:p>
+    <w:p>
+      <w:pPr>
+        <w:spacing w:after="80" w:before="80" w:line="276"/>
+      </w:pPr>
+      <w:r>
+        <w:rPr>
+          <w:rFonts w:ascii="Times New Roman" w:cs="Times New Roman" w:eastAsia="Times New Roman" w:hAnsi="Times New Roman"/>
+          <w:b w:val="false"/>
+          <w:bCs w:val="false"/>
+          <w:color w:val="1F2937"/>
+          <w:sz w:val="22"/>
+          <w:szCs w:val="22"/>
+        </w:rPr>
+        <w:t xml:space="preserve">Version initiale : « # Erreur 3 : tentative de path traversal (doit retourner 403) ». Le test retourne 404. Vérifié en exécutant réellement les quatre requêtes de l'étape 4 sur le serveur du projet, le 21/08/2026 : paramètre manquant 400, catégorie inconnue 400, path traversal 404, route inconnue 404. Trois formes supplémentaires ont été essayées (/%2e%2e/%2e%2e/etc/passwd, /..%2f..%2fetc/passwd, /....//....//etc/passwd) et une exécution avec curl --path-as-is, pour écarter l'hypothèse d'une normalisation par le client : toutes renvoient 404. La branche 403 de scripts/serveur.js n'est donc pas atteignable par une requête HTTP en l'état du code. Le garde-fou lui-même est correct et reste en place ; c'est l'exercice qui ne l'exerçait pas. Un paragraphe d'explication a été ajouté sous le bloc de commandes, avec la raison technique et ce que le cas enseigne sur la défense en profondeur.</w:t>
+      </w:r>
+    </w:p>
+    <w:p>
+      <w:pPr>
+        <w:spacing w:after="80" w:before="80" w:line="276"/>
+      </w:pPr>
+      <w:r>
+        <w:rPr>
+          <w:rFonts w:ascii="Times New Roman" w:cs="Times New Roman" w:eastAsia="Times New Roman" w:hAnsi="Times New Roman"/>
+          <w:b w:val="false"/>
+          <w:bCs w:val="false"/>
+          <w:color w:val="1F2937"/>
+          <w:sz w:val="22"/>
+          <w:szCs w:val="22"/>
+        </w:rPr>
+        <w:t xml:space="preserve">Vérifié lors de la relecture et inchangé : les trois autres codes HTTP de l'étape 4 ; la réponse de /api/livrables?categorie=lecons (clés categorie, nombre, livrables ; 215 leçons ; date et slug conformes, date: null hors convention) ; l'obligation de fournir une base à new URL() ; la dépréciation d'url.parse() depuis Node.js v11 ; et les six liens de la bibliographie, testés au moment de la génération.</w:t>
       </w:r>
     </w:p>
     <w:sectPr>

</xml_diff>

<commit_message>
fix(lecons): quatre corrections de relecture sur la leçon appli-ia 04
- Indice de l'étape PRÉDIRE : la catégorie « lecons » couvre .docx ET
  .md, donc ~214 fichiers et non 107 — la commande donnée conduisait à
  une prédiction fausse d'un facteur 2.
- url.parse() : le tableau History officiel montre une dépréciation en
  v11 RÉVOQUÉE en v14.17/v15.13 (« Legacy » = état non déprécié), puis
  application deprecation en v24.0.0. Libellé actuel : 0 - Deprecated.
- scripts/serveur.js fait 276 lignes, pas 277.
- Avertissement ajouté sur l'écart doc (v26.7.0) / runtime (v24.15.0).

Coquille « Reperer » corrigée. Formulations d'origine conservées dans
le journal des corrections, qui compte désormais cinq entrées.

Co-Authored-By: Claude Opus 5 <noreply@anthropic.com>
</commit_message>
<xml_diff>
--- a/livrables/lecons/2026-08-21_lecon-appli-ia_04_donnees-reelles-api-fichiers.docx
+++ b/livrables/lecons/2026-08-21_lecon-appli-ia_04_donnees-reelles-api-fichiers.docx
@@ -1499,6 +1499,22 @@
               <w:t xml:space="preserve">Source vérifiée : nodejs.org/api/fs.html#promises-api (Node.js v26.7.0, 21/08/2026)</w:t>
             </w:r>
           </w:p>
+          <w:p>
+            <w:pPr>
+              <w:spacing w:after="80" w:before="80" w:line="276"/>
+            </w:pPr>
+            <w:r>
+              <w:rPr>
+                <w:rFonts w:ascii="Times New Roman" w:cs="Times New Roman" w:eastAsia="Times New Roman" w:hAnsi="Times New Roman"/>
+                <w:b w:val="false"/>
+                <w:bCs w:val="false"/>
+                <w:color w:val="1F2937"/>
+                <w:sz w:val="22"/>
+                <w:szCs w:val="22"/>
+              </w:rPr>
+              <w:t xml:space="preserve">⚠️ Écart facile à manquer : nodejs.org publie la documentation de la version COURANTE, ici v26.7.0, alors que ce projet tourne sur Node.js v24.15.0 (LTS, arrêté en leçon 01). Les trois méthodes utilisées ici se comportent de la même façon dans les deux versions, mais prends l'habitude de lire le bandeau de version en haut de chaque page de doc : une option ajoutée en v25 ou v26 n'existera pas sur ton poste.</w:t>
+            </w:r>
+          </w:p>
         </w:tc>
       </w:tr>
     </w:tbl>
@@ -1704,7 +1720,7 @@
                 <w:sz w:val="22"/>
                 <w:szCs w:val="22"/>
               </w:rPr>
-              <w:t xml:space="preserve">⚠️ url.parse() est déprécié depuis Node.js v11 (marqué Legacy dans la documentation officielle). Ne l'utilise pas dans du nouveau code. L'IA le propose encore souvent car il était très répandu jusqu'en 2019.</w:t>
+              <w:t xml:space="preserve">⚠️ url.parse() est déprécié, mais son histoire est moins linéaire qu'on ne le dit et le tableau « History » de la page officielle vaut d'être lu : dépréciation en v11.0.0, RÉVOCATION de cette dépréciation en v14.17.0 / v15.13.0 (retour au statut « Legacy »), dépréciation documentaire en v18.13.0 / v19.0.0, puis application deprecation en v24.0.0. Le libellé de stabilité actuel est « 0 - Deprecated: Use the WHATWG URL API instead ». La version qui te concerne est donc v24 — celle que fait tourner ce projet. Ne l'utilise pas dans du nouveau code ; l'IA le propose encore souvent car il était très répandu jusqu'en 2019.</w:t>
             </w:r>
           </w:p>
           <w:p>
@@ -2254,7 +2270,7 @@
           <w:sz w:val="22"/>
           <w:szCs w:val="22"/>
         </w:rPr>
-        <w:t xml:space="preserve">Le fichier fait 277 lignes. Voici les quatre extraits que tu vas travailler — le fichier complet est lisible sur le disque.</w:t>
+        <w:t xml:space="preserve">Le fichier fait 276 lignes. Voici les quatre extraits que tu vas travailler — le fichier complet est lisible sur le disque.</w:t>
       </w:r>
     </w:p>
     <w:p>
@@ -4001,7 +4017,7 @@
           <w:sz w:val="22"/>
           <w:szCs w:val="22"/>
         </w:rPr>
-        <w:t xml:space="preserve">•  Combien de fichiers environ ? (tu peux compter avec : ls livrables/lecons/*.docx | wc -l)</w:t>
+        <w:t xml:space="preserve">•  Combien de fichiers environ ? (tu peux compter avec : ls livrables/lecons/*.docx livrables/lecons/*.md | wc -l — la catégorie « lecons » est déclarée extensions: ['.docx', '.md'], les deux comptent)</w:t>
       </w:r>
     </w:p>
     <w:p>
@@ -5201,7 +5217,7 @@
           <w:sz w:val="22"/>
           <w:szCs w:val="22"/>
         </w:rPr>
-        <w:t xml:space="preserve">•  ☐ Reperer un livrable avec date en préfixe (date: '2026-XX-XX') et un ancien sans (date: null).</w:t>
+        <w:t xml:space="preserve">•  ☐ Repérer un livrable avec date en préfixe (date: '2026-XX-XX') et un ancien sans (date: null).</w:t>
       </w:r>
     </w:p>
     <w:p>
@@ -5751,7 +5767,7 @@
           <w:sz w:val="22"/>
           <w:szCs w:val="22"/>
         </w:rPr>
-        <w:t xml:space="preserve">Leçon produite le 21/08/2026 à 09h19 (seconde version) et relue le jour même. La correction est fondue dans le texte ci-dessus ; la formulation d'origine est conservée ici.</w:t>
+        <w:t xml:space="preserve">Leçon produite le 21/08/2026 à 09h19 (seconde version) et relue le jour même, en deux passes : le test de path traversal d'abord, puis une relecture complète qui a relevé quatre points supplémentaires. Les cinq corrections sont fondues dans le texte ci-dessus ; les formulations d'origine sont conservées ici.</w:t>
       </w:r>
     </w:p>
     <w:p>
@@ -5784,6 +5800,134 @@
           <w:szCs w:val="22"/>
         </w:rPr>
         <w:t xml:space="preserve">Version initiale : « # Erreur 3 : tentative de path traversal (doit retourner 403) ». Le test retourne 404. Vérifié en exécutant réellement les quatre requêtes de l'étape 4 sur le serveur du projet, le 21/08/2026 : paramètre manquant 400, catégorie inconnue 400, path traversal 404, route inconnue 404. Trois formes supplémentaires ont été essayées (/%2e%2e/%2e%2e/etc/passwd, /..%2f..%2fetc/passwd, /....//....//etc/passwd) et une exécution avec curl --path-as-is, pour écarter l'hypothèse d'une normalisation par le client : toutes renvoient 404. La branche 403 de scripts/serveur.js n'est donc pas atteignable par une requête HTTP en l'état du code. Le garde-fou lui-même est correct et reste en place ; c'est l'exercice qui ne l'exerçait pas. Un paragraphe d'explication a été ajouté sous le bloc de commandes, avec la raison technique et ce que le cas enseigne sur la défense en profondeur.</w:t>
+      </w:r>
+    </w:p>
+    <w:p>
+      <w:pPr>
+        <w:spacing w:after="80" w:before="80" w:line="276"/>
+      </w:pPr>
+      <w:r>
+        <w:rPr>
+          <w:rFonts w:ascii="Times New Roman" w:cs="Times New Roman" w:eastAsia="Times New Roman" w:hAnsi="Times New Roman"/>
+          <w:b w:val="false"/>
+          <w:bCs w:val="false"/>
+          <w:color w:val="1F2937"/>
+          <w:sz w:val="22"/>
+          <w:szCs w:val="22"/>
+        </w:rPr>
+        <w:t xml:space="preserve">2. Indice de l'étape 2 (PRÉDIRE) — nombre de fichiers attendu.</w:t>
+      </w:r>
+    </w:p>
+    <w:p>
+      <w:pPr>
+        <w:spacing w:after="80" w:before="80" w:line="276"/>
+      </w:pPr>
+      <w:r>
+        <w:rPr>
+          <w:rFonts w:ascii="Times New Roman" w:cs="Times New Roman" w:eastAsia="Times New Roman" w:hAnsi="Times New Roman"/>
+          <w:b w:val="false"/>
+          <w:bCs w:val="false"/>
+          <w:color w:val="1F2937"/>
+          <w:sz w:val="22"/>
+          <w:szCs w:val="22"/>
+        </w:rPr>
+        <w:t xml:space="preserve">Version initiale : « Combien de fichiers environ ? (tu peux compter avec : ls livrables/lecons/*.docx | wc -l) ». Cette commande retourne 107, alors que l'API en retourne environ 214 : la catégorie « lecons » est déclarée extensions: ['.docx', '.md'] (ligne 32 du fichier reproduit plus haut dans cette leçon), et le dossier contient une fiche Markdown par leçon. L'indice conduisait donc à une prédiction fausse d'un facteur 2, dans l'exercice dont le principe même est de prédire puis de vérifier. Comptages relevés le 21/08/2026 : 107 .docx et 107 .md.</w:t>
+      </w:r>
+    </w:p>
+    <w:p>
+      <w:pPr>
+        <w:spacing w:after="80" w:before="80" w:line="276"/>
+      </w:pPr>
+      <w:r>
+        <w:rPr>
+          <w:rFonts w:ascii="Times New Roman" w:cs="Times New Roman" w:eastAsia="Times New Roman" w:hAnsi="Times New Roman"/>
+          <w:b w:val="false"/>
+          <w:bCs w:val="false"/>
+          <w:color w:val="1F2937"/>
+          <w:sz w:val="22"/>
+          <w:szCs w:val="22"/>
+        </w:rPr>
+        <w:t xml:space="preserve">3. Datation de la dépréciation d'url.parse().</w:t>
+      </w:r>
+    </w:p>
+    <w:p>
+      <w:pPr>
+        <w:spacing w:after="80" w:before="80" w:line="276"/>
+      </w:pPr>
+      <w:r>
+        <w:rPr>
+          <w:rFonts w:ascii="Times New Roman" w:cs="Times New Roman" w:eastAsia="Times New Roman" w:hAnsi="Times New Roman"/>
+          <w:b w:val="false"/>
+          <w:bCs w:val="false"/>
+          <w:color w:val="1F2937"/>
+          <w:sz w:val="22"/>
+          <w:szCs w:val="22"/>
+        </w:rPr>
+        <w:t xml:space="preserve">Version initiale : « url.parse() est déprécié depuis Node.js v11 (marqué Legacy dans la documentation officielle) ». Le tableau History de nodejs.org/api/url.html, consulté le 21/08/2026, donne une histoire moins linéaire : v11.0.0 dépréciation, v14.17.0 / v15.13.0 RÉVOCATION avec retour au statut « Legacy », v18.13.0 / v19.0.0 dépréciation documentaire, v24.0.0 application deprecation. « Marqué Legacy » décrivait donc l'état NON déprécié de 2021 ; le libellé actuel est « Stability: 0 - Deprecated ». La version qui concerne ce projet est v24, celle qu'il fait tourner.</w:t>
+      </w:r>
+    </w:p>
+    <w:p>
+      <w:pPr>
+        <w:spacing w:after="80" w:before="80" w:line="276"/>
+      </w:pPr>
+      <w:r>
+        <w:rPr>
+          <w:rFonts w:ascii="Times New Roman" w:cs="Times New Roman" w:eastAsia="Times New Roman" w:hAnsi="Times New Roman"/>
+          <w:b w:val="false"/>
+          <w:bCs w:val="false"/>
+          <w:color w:val="1F2937"/>
+          <w:sz w:val="22"/>
+          <w:szCs w:val="22"/>
+        </w:rPr>
+        <w:t xml:space="preserve">4. Nombre de lignes de scripts/serveur.js.</w:t>
+      </w:r>
+    </w:p>
+    <w:p>
+      <w:pPr>
+        <w:spacing w:after="80" w:before="80" w:line="276"/>
+      </w:pPr>
+      <w:r>
+        <w:rPr>
+          <w:rFonts w:ascii="Times New Roman" w:cs="Times New Roman" w:eastAsia="Times New Roman" w:hAnsi="Times New Roman"/>
+          <w:b w:val="false"/>
+          <w:bCs w:val="false"/>
+          <w:color w:val="1F2937"/>
+          <w:sz w:val="22"/>
+          <w:szCs w:val="22"/>
+        </w:rPr>
+        <w:t xml:space="preserve">Version initiale : « Le fichier fait 277 lignes ». Il en fait 276 — le fichier se termine par un saut de ligne. Les quatre plages d'extraits citées (1-38, 53-70, 88-127, 189-231) ont été contrôlées une à une et sont exactes, de même que la ligne 24 (PORT) et la ligne 238 (garde-fou).</w:t>
+      </w:r>
+    </w:p>
+    <w:p>
+      <w:pPr>
+        <w:spacing w:after="80" w:before="80" w:line="276"/>
+      </w:pPr>
+      <w:r>
+        <w:rPr>
+          <w:rFonts w:ascii="Times New Roman" w:cs="Times New Roman" w:eastAsia="Times New Roman" w:hAnsi="Times New Roman"/>
+          <w:b w:val="false"/>
+          <w:bCs w:val="false"/>
+          <w:color w:val="1F2937"/>
+          <w:sz w:val="22"/>
+          <w:szCs w:val="22"/>
+        </w:rPr>
+        <w:t xml:space="preserve">5. Écart entre version de documentation et version d'exécution.</w:t>
+      </w:r>
+    </w:p>
+    <w:p>
+      <w:pPr>
+        <w:spacing w:after="80" w:before="80" w:line="276"/>
+      </w:pPr>
+      <w:r>
+        <w:rPr>
+          <w:rFonts w:ascii="Times New Roman" w:cs="Times New Roman" w:eastAsia="Times New Roman" w:hAnsi="Times New Roman"/>
+          <w:b w:val="false"/>
+          <w:bCs w:val="false"/>
+          <w:color w:val="1F2937"/>
+          <w:sz w:val="22"/>
+          <w:szCs w:val="22"/>
+        </w:rPr>
+        <w:t xml:space="preserve">Les sources sont datées « Node.js v26.7.0 » : c'est exact, nodejs.org publie la version courante. Mais le poste tourne en v24.15.0 et PROJET.md fixe Node.js v24 LTS. Rien ne le signalait ; un avertissement a été ajouté sous la première source citée. Coquille corrigée au passage dans la check-list : « Reperer » est devenu « Repérer ».</w:t>
       </w:r>
     </w:p>
     <w:p>

</xml_diff>